<commit_message>
tweak(EM): handle filemanager folder update name and add logo in export zuschuesse
</commit_message>
<xml_diff>
--- a/tine20/EventManager/Export/templates/vorlage_zuschuesse.docx
+++ b/tine20/EventManager/Export/templates/vorlage_zuschuesse.docx
@@ -831,8 +831,8 @@
         <w:gridCol w:w="991"/>
         <w:gridCol w:w="1125"/>
         <w:gridCol w:w="3663"/>
-        <w:gridCol w:w="2456"/>
-        <w:gridCol w:w="693"/>
+        <w:gridCol w:w="2458"/>
+        <w:gridCol w:w="691"/>
       </w:tblGrid>
       <w:tr>
         <w:trPr/>
@@ -1443,7 +1443,7 @@
         </w:tc>
         <w:tc>
           <w:tcPr>
-            <w:tcW w:w="2456" w:type="dxa"/>
+            <w:tcW w:w="2458" w:type="dxa"/>
             <w:tcBorders>
               <w:top w:val="single" w:sz="8" w:space="0" w:color="000000"/>
               <w:left w:val="single" w:sz="8" w:space="0" w:color="000000"/>
@@ -1479,7 +1479,7 @@
         </w:tc>
         <w:tc>
           <w:tcPr>
-            <w:tcW w:w="693" w:type="dxa"/>
+            <w:tcW w:w="691" w:type="dxa"/>
             <w:tcBorders>
               <w:top w:val="single" w:sz="8" w:space="0" w:color="000000"/>
               <w:left w:val="single" w:sz="8" w:space="0" w:color="000000"/>
@@ -1575,23 +1575,7 @@
                 <w:sz w:val="16"/>
                 <w:szCs w:val="16"/>
               </w:rPr>
-              <w:t>{{ record.participant.n_f</w:t>
-            </w:r>
-            <w:r>
-              <w:rPr>
-                <w:kern w:val="0"/>
-                <w:sz w:val="16"/>
-                <w:szCs w:val="16"/>
-              </w:rPr>
-              <w:t>ileas</w:t>
-            </w:r>
-            <w:r>
-              <w:rPr>
-                <w:kern w:val="0"/>
-                <w:sz w:val="16"/>
-                <w:szCs w:val="16"/>
-              </w:rPr>
-              <w:t xml:space="preserve"> }}</w:t>
+              <w:t>{{ record.participant.n_fileas }}</w:t>
             </w:r>
           </w:p>
           <w:p>
@@ -1763,7 +1747,7 @@
         </w:tc>
         <w:tc>
           <w:tcPr>
-            <w:tcW w:w="2456" w:type="dxa"/>
+            <w:tcW w:w="2458" w:type="dxa"/>
             <w:tcBorders>
               <w:top w:val="single" w:sz="8" w:space="0" w:color="000000"/>
               <w:left w:val="single" w:sz="8" w:space="0" w:color="000000"/>
@@ -1794,7 +1778,7 @@
         </w:tc>
         <w:tc>
           <w:tcPr>
-            <w:tcW w:w="693" w:type="dxa"/>
+            <w:tcW w:w="691" w:type="dxa"/>
             <w:tcBorders>
               <w:top w:val="single" w:sz="8" w:space="0" w:color="000000"/>
               <w:left w:val="single" w:sz="8" w:space="0" w:color="000000"/>
@@ -1912,7 +1896,7 @@
               <wp:extent cx="390525" cy="285750"/>
               <wp:effectExtent l="6350" t="6350" r="6350" b="6350"/>
               <wp:wrapNone/>
-              <wp:docPr id="1" name="Shape1"/>
+              <wp:docPr id="2" name="Shape1"/>
               <a:graphic xmlns:a="http://schemas.openxmlformats.org/drawingml/2006/main">
                 <a:graphicData uri="http://schemas.microsoft.com/office/word/2010/wordprocessingShape">
                   <wps:wsp>
@@ -2174,7 +2158,7 @@
               <wp:extent cx="390525" cy="285750"/>
               <wp:effectExtent l="6350" t="6350" r="6350" b="6350"/>
               <wp:wrapNone/>
-              <wp:docPr id="2" name="Shape2"/>
+              <wp:docPr id="3" name="Shape2"/>
               <a:graphic xmlns:a="http://schemas.openxmlformats.org/drawingml/2006/main">
                 <a:graphicData uri="http://schemas.microsoft.com/office/word/2010/wordprocessingShape">
                   <wps:wsp>
@@ -2245,31 +2229,7 @@
         <w:szCs w:val="18"/>
         <w:u w:val="none"/>
       </w:rPr>
-      <w:t>{{ EVENT.event_employee.n_f</w:t>
-    </w:r>
-    <w:r>
-      <w:rPr>
-        <w:b/>
-        <w:bCs/>
-        <w:color w:themeColor="background1" w:themeShade="80" w:val="808080"/>
-        <w:kern w:val="0"/>
-        <w:sz w:val="18"/>
-        <w:szCs w:val="18"/>
-        <w:u w:val="none"/>
-      </w:rPr>
-      <w:t>ileas</w:t>
-    </w:r>
-    <w:r>
-      <w:rPr>
-        <w:b/>
-        <w:bCs/>
-        <w:color w:themeColor="background1" w:themeShade="80" w:val="808080"/>
-        <w:kern w:val="0"/>
-        <w:sz w:val="18"/>
-        <w:szCs w:val="18"/>
-        <w:u w:val="none"/>
-      </w:rPr>
-      <w:t xml:space="preserve"> }}</w:t>
+      <w:t>{{ EVENT.event_employee.n_fileas }}</w:t>
     </w:r>
   </w:p>
   <w:p>
@@ -2519,7 +2479,7 @@
     <w:pPr>
       <w:pStyle w:val="Header"/>
       <w:ind w:right="-142"/>
-      <w:jc w:val="left"/>
+      <w:jc w:val="right"/>
       <w:rPr>
         <w:rFonts w:ascii="Arial" w:hAnsi="Arial" w:cs="Arial"/>
       </w:rPr>
@@ -2528,6 +2488,51 @@
       <w:rPr>
         <w:rFonts w:cs="Arial"/>
       </w:rPr>
+      <w:drawing>
+        <wp:anchor behindDoc="0" distT="0" distB="0" distL="0" distR="0" simplePos="0" locked="0" layoutInCell="0" allowOverlap="1" relativeHeight="4">
+          <wp:simplePos x="0" y="0"/>
+          <wp:positionH relativeFrom="column">
+            <wp:posOffset>8100695</wp:posOffset>
+          </wp:positionH>
+          <wp:positionV relativeFrom="paragraph">
+            <wp:posOffset>635</wp:posOffset>
+          </wp:positionV>
+          <wp:extent cx="1663065" cy="597535"/>
+          <wp:effectExtent l="0" t="0" r="0" b="0"/>
+          <wp:wrapSquare wrapText="largest"/>
+          <wp:docPr id="1" name="Image1" descr=""/>
+          <wp:cNvGraphicFramePr>
+            <a:graphicFrameLocks xmlns:a="http://schemas.openxmlformats.org/drawingml/2006/main" noChangeAspect="1"/>
+          </wp:cNvGraphicFramePr>
+          <a:graphic xmlns:a="http://schemas.openxmlformats.org/drawingml/2006/main">
+            <a:graphicData uri="http://schemas.openxmlformats.org/drawingml/2006/picture">
+              <pic:pic xmlns:pic="http://schemas.openxmlformats.org/drawingml/2006/picture">
+                <pic:nvPicPr>
+                  <pic:cNvPr id="1" name="Image1" descr=""/>
+                  <pic:cNvPicPr>
+                    <a:picLocks noChangeAspect="1" noChangeArrowheads="1"/>
+                  </pic:cNvPicPr>
+                </pic:nvPicPr>
+                <pic:blipFill>
+                  <a:blip r:embed="rId1"/>
+                  <a:stretch>
+                    <a:fillRect/>
+                  </a:stretch>
+                </pic:blipFill>
+                <pic:spPr bwMode="auto">
+                  <a:xfrm>
+                    <a:off x="0" y="0"/>
+                    <a:ext cx="1663065" cy="597535"/>
+                  </a:xfrm>
+                  <a:prstGeom prst="rect">
+                    <a:avLst/>
+                  </a:prstGeom>
+                </pic:spPr>
+              </pic:pic>
+            </a:graphicData>
+          </a:graphic>
+        </wp:anchor>
+      </w:drawing>
     </w:r>
   </w:p>
   <w:p>

</xml_diff>